<commit_message>
redirecciones de los navbars arregladas para ser funcionales en el server
</commit_message>
<xml_diff>
--- a/documentation/Moreno_Pol_Creation_Container_MySQL_DB.docx
+++ b/documentation/Moreno_Pol_Creation_Container_MySQL_DB.docx
@@ -157,6 +157,83 @@
     </w:p>
     <w:p>
       <w:r>
+        <w:t xml:space="preserve">Si </w:t>
+      </w:r>
+      <w:proofErr w:type="spellStart"/>
+      <w:r>
+        <w:t>calgues</w:t>
+      </w:r>
+      <w:proofErr w:type="spellEnd"/>
+      <w:r>
+        <w:t xml:space="preserve"> arrancarlo, </w:t>
+      </w:r>
+      <w:proofErr w:type="spellStart"/>
+      <w:r>
+        <w:t>amb</w:t>
+      </w:r>
+      <w:proofErr w:type="spellEnd"/>
+      <w:r>
+        <w:t xml:space="preserve"> la comanda: </w:t>
+      </w:r>
+      <w:proofErr w:type="gramStart"/>
+      <w:r>
+        <w:rPr>
+          <w:b/>
+          <w:bCs/>
+          <w:u w:val="single"/>
+        </w:rPr>
+        <w:t xml:space="preserve">&gt;  </w:t>
+      </w:r>
+      <w:proofErr w:type="spellStart"/>
+      <w:r>
+        <w:rPr>
+          <w:b/>
+          <w:bCs/>
+          <w:u w:val="single"/>
+        </w:rPr>
+        <w:t>docker</w:t>
+      </w:r>
+      <w:proofErr w:type="spellEnd"/>
+      <w:proofErr w:type="gramEnd"/>
+      <w:r>
+        <w:rPr>
+          <w:b/>
+          <w:bCs/>
+          <w:u w:val="single"/>
+        </w:rPr>
+        <w:t xml:space="preserve"> </w:t>
+      </w:r>
+      <w:proofErr w:type="spellStart"/>
+      <w:r>
+        <w:rPr>
+          <w:b/>
+          <w:bCs/>
+          <w:u w:val="single"/>
+        </w:rPr>
+        <w:t>start</w:t>
+      </w:r>
+      <w:proofErr w:type="spellEnd"/>
+      <w:r>
+        <w:rPr>
+          <w:b/>
+          <w:bCs/>
+          <w:u w:val="single"/>
+        </w:rPr>
+        <w:t xml:space="preserve"> </w:t>
+      </w:r>
+      <w:proofErr w:type="spellStart"/>
+      <w:r>
+        <w:rPr>
+          <w:b/>
+          <w:bCs/>
+          <w:u w:val="single"/>
+        </w:rPr>
+        <w:t>mysql-bees-cavern</w:t>
+      </w:r>
+      <w:proofErr w:type="spellEnd"/>
+    </w:p>
+    <w:p>
+      <w:r>
         <w:t>Con el comando “</w:t>
       </w:r>
       <w:proofErr w:type="spellStart"/>
@@ -441,7 +518,6 @@
     <w:p/>
     <w:p>
       <w:r>
-        <w:lastRenderedPageBreak/>
         <w:t xml:space="preserve">El siguiente paso </w:t>
       </w:r>
       <w:r>

</xml_diff>